<commit_message>
Improve design_documents/MPA_SRS.docx : Modified the introduction to contain more details.
</commit_message>
<xml_diff>
--- a/design_documents/MPA_SRS.docx
+++ b/design_documents/MPA_SRS.docx
@@ -1,6 +1,6 @@
 
 <file path=word/document.xml><?xml version="1.0" encoding="utf-8"?>
-<w:document xmlns:wpc="http://schemas.microsoft.com/office/word/2010/wordprocessingCanvas" xmlns:cx="http://schemas.microsoft.com/office/drawing/2014/chartex" xmlns:cx1="http://schemas.microsoft.com/office/drawing/2015/9/8/chartex" xmlns:cx2="http://schemas.microsoft.com/office/drawing/2015/10/21/chartex" xmlns:cx3="http://schemas.microsoft.com/office/drawing/2016/5/9/chartex" xmlns:cx4="http://schemas.microsoft.com/office/drawing/2016/5/10/chartex" xmlns:cx5="http://schemas.microsoft.com/office/drawing/2016/5/11/chartex" xmlns:cx6="http://schemas.microsoft.com/office/drawing/2016/5/12/chartex" xmlns:cx7="http://schemas.microsoft.com/office/drawing/2016/5/13/chartex" xmlns:cx8="http://schemas.microsoft.com/office/drawing/2016/5/14/chartex" xmlns:mc="http://schemas.openxmlformats.org/markup-compatibility/2006" xmlns:aink="http://schemas.microsoft.com/office/drawing/2016/ink" xmlns:am3d="http://schemas.microsoft.com/office/drawing/2017/model3d" xmlns:o="urn:schemas-microsoft-com:office:office" xmlns:oel="http://schemas.microsoft.com/office/2019/extlst" xmlns:r="http://schemas.openxmlformats.org/officeDocument/2006/relationships" xmlns:m="http://schemas.openxmlformats.org/officeDocument/2006/math" xmlns:v="urn:schemas-microsoft-com:vml" xmlns:wp14="http://schemas.microsoft.com/office/word/2010/wordprocessingDrawing" xmlns:wp="http://schemas.openxmlformats.org/drawingml/2006/wordprocessingDrawing" xmlns:w10="urn:schemas-microsoft-com:office:word" xmlns:w="http://schemas.openxmlformats.org/wordprocessingml/2006/main" xmlns:w14="http://schemas.microsoft.com/office/word/2010/wordml" xmlns:w15="http://schemas.microsoft.com/office/word/2012/wordml" xmlns:w16cex="http://schemas.microsoft.com/office/word/2018/wordml/cex" xmlns:w16cid="http://schemas.microsoft.com/office/word/2016/wordml/cid" xmlns:w16="http://schemas.microsoft.com/office/word/2018/wordml" xmlns:w16sdtdh="http://schemas.microsoft.com/office/word/2020/wordml/sdtdatahash" xmlns:w16se="http://schemas.microsoft.com/office/word/2015/wordml/symex" xmlns:wpg="http://schemas.microsoft.com/office/word/2010/wordprocessingGroup" xmlns:wpi="http://schemas.microsoft.com/office/word/2010/wordprocessingInk" xmlns:wne="http://schemas.microsoft.com/office/word/2006/wordml" xmlns:wps="http://schemas.microsoft.com/office/word/2010/wordprocessingShape" mc:Ignorable="w14 w15 w16se w16cid w16 w16cex w16sdtdh wp14">
+<w:document xmlns:wpc="http://schemas.microsoft.com/office/word/2010/wordprocessingCanvas" xmlns:cx="http://schemas.microsoft.com/office/drawing/2014/chartex" xmlns:cx1="http://schemas.microsoft.com/office/drawing/2015/9/8/chartex" xmlns:cx2="http://schemas.microsoft.com/office/drawing/2015/10/21/chartex" xmlns:cx3="http://schemas.microsoft.com/office/drawing/2016/5/9/chartex" xmlns:cx4="http://schemas.microsoft.com/office/drawing/2016/5/10/chartex" xmlns:cx5="http://schemas.microsoft.com/office/drawing/2016/5/11/chartex" xmlns:cx6="http://schemas.microsoft.com/office/drawing/2016/5/12/chartex" xmlns:cx7="http://schemas.microsoft.com/office/drawing/2016/5/13/chartex" xmlns:cx8="http://schemas.microsoft.com/office/drawing/2016/5/14/chartex" xmlns:mc="http://schemas.openxmlformats.org/markup-compatibility/2006" xmlns:aink="http://schemas.microsoft.com/office/drawing/2016/ink" xmlns:am3d="http://schemas.microsoft.com/office/drawing/2017/model3d" xmlns:o="urn:schemas-microsoft-com:office:office" xmlns:oel="http://schemas.microsoft.com/office/2019/extlst" xmlns:r="http://schemas.openxmlformats.org/officeDocument/2006/relationships" xmlns:m="http://schemas.openxmlformats.org/officeDocument/2006/math" xmlns:v="urn:schemas-microsoft-com:vml" xmlns:wp14="http://schemas.microsoft.com/office/word/2010/wordprocessingDrawing" xmlns:wp="http://schemas.openxmlformats.org/drawingml/2006/wordprocessingDrawing" xmlns:w10="urn:schemas-microsoft-com:office:word" xmlns:w="http://schemas.openxmlformats.org/wordprocessingml/2006/main" xmlns:w14="http://schemas.microsoft.com/office/word/2010/wordml" xmlns:w15="http://schemas.microsoft.com/office/word/2012/wordml" xmlns:w16cex="http://schemas.microsoft.com/office/word/2018/wordml/cex" xmlns:w16cid="http://schemas.microsoft.com/office/word/2016/wordml/cid" xmlns:w16="http://schemas.microsoft.com/office/word/2018/wordml" xmlns:w16du="http://schemas.microsoft.com/office/word/2023/wordml/word16du" xmlns:w16sdtdh="http://schemas.microsoft.com/office/word/2020/wordml/sdtdatahash" xmlns:w16sdtfl="http://schemas.microsoft.com/office/word/2024/wordml/sdtformatlock" xmlns:w16se="http://schemas.microsoft.com/office/word/2015/wordml/symex" xmlns:wpg="http://schemas.microsoft.com/office/word/2010/wordprocessingGroup" xmlns:wpi="http://schemas.microsoft.com/office/word/2010/wordprocessingInk" xmlns:wne="http://schemas.microsoft.com/office/word/2006/wordml" xmlns:wps="http://schemas.microsoft.com/office/word/2010/wordprocessingShape" mc:Ignorable="w14 w15 w16se w16cid w16 w16cex w16sdtdh w16sdtfl w16du wp14">
   <w:body>
     <w:p>
       <w:pPr>
@@ -116,20 +116,8 @@
           <w:szCs w:val="44"/>
         </w:rPr>
         <w:tab/>
-        <w:t xml:space="preserve">by: Cristina </w:t>
-      </w:r>
-      <w:proofErr w:type="spellStart"/>
-      <w:r>
-        <w:rPr>
-          <w:rFonts w:asciiTheme="majorHAnsi" w:hAnsiTheme="majorHAnsi" w:cstheme="majorHAnsi"/>
-          <w:b/>
-          <w:bCs/>
-          <w:sz w:val="44"/>
-          <w:szCs w:val="44"/>
-        </w:rPr>
-        <w:t>Mitrea</w:t>
-      </w:r>
-      <w:proofErr w:type="spellEnd"/>
+        <w:t>by: Cristina Mitrea</w:t>
+      </w:r>
     </w:p>
     <w:p>
       <w:pPr>
@@ -187,37 +175,7 @@
           <w:sz w:val="36"/>
           <w:szCs w:val="36"/>
         </w:rPr>
-        <w:t xml:space="preserve">A tool to </w:t>
-      </w:r>
-      <w:r>
-        <w:rPr>
-          <w:rFonts w:asciiTheme="majorHAnsi" w:hAnsiTheme="majorHAnsi" w:cstheme="majorHAnsi"/>
-          <w:b/>
-          <w:bCs/>
-          <w:sz w:val="36"/>
-          <w:szCs w:val="36"/>
-        </w:rPr>
-        <w:t>identify significantly perturbed</w:t>
-      </w:r>
-      <w:r>
-        <w:rPr>
-          <w:rFonts w:asciiTheme="majorHAnsi" w:hAnsiTheme="majorHAnsi" w:cstheme="majorHAnsi"/>
-          <w:b/>
-          <w:bCs/>
-          <w:sz w:val="36"/>
-          <w:szCs w:val="36"/>
-        </w:rPr>
-        <w:t xml:space="preserve"> </w:t>
-      </w:r>
-      <w:r>
-        <w:rPr>
-          <w:rFonts w:asciiTheme="majorHAnsi" w:hAnsiTheme="majorHAnsi" w:cstheme="majorHAnsi"/>
-          <w:b/>
-          <w:bCs/>
-          <w:sz w:val="36"/>
-          <w:szCs w:val="36"/>
-        </w:rPr>
-        <w:t xml:space="preserve">metabolic pathways from </w:t>
+        <w:t xml:space="preserve">The MPA tool is designed to identify significantly perturbed metabolic pathways from the </w:t>
       </w:r>
       <w:proofErr w:type="spellStart"/>
       <w:r>
@@ -239,7 +197,7 @@
           <w:sz w:val="36"/>
           <w:szCs w:val="36"/>
         </w:rPr>
-        <w:t xml:space="preserve"> for a condition under study when comparing to control/healthy</w:t>
+        <w:t xml:space="preserve"> database for a condition under study compared to control (healthy) samples.</w:t>
       </w:r>
     </w:p>
     <w:p>
@@ -249,33 +207,10 @@
           <w:rFonts w:asciiTheme="majorHAnsi" w:hAnsiTheme="majorHAnsi" w:cstheme="majorHAnsi"/>
           <w:b/>
           <w:bCs/>
-          <w:sz w:val="32"/>
-          <w:szCs w:val="32"/>
-        </w:rPr>
-      </w:pPr>
-      <w:hyperlink r:id="rId5" w:history="1">
-        <w:r>
-          <w:rPr>
-            <w:rStyle w:val="Hyperlink"/>
-            <w:rFonts w:asciiTheme="majorHAnsi" w:hAnsiTheme="majorHAnsi" w:cstheme="majorHAnsi"/>
-            <w:b/>
-            <w:bCs/>
-            <w:sz w:val="32"/>
-            <w:szCs w:val="32"/>
-          </w:rPr>
-          <w:t>https://reactome.org/PathwayBrowser/</w:t>
-        </w:r>
-      </w:hyperlink>
-      <w:r>
-        <w:rPr>
-          <w:rFonts w:asciiTheme="majorHAnsi" w:hAnsiTheme="majorHAnsi" w:cstheme="majorHAnsi"/>
-          <w:b/>
-          <w:bCs/>
-          <w:sz w:val="32"/>
-          <w:szCs w:val="32"/>
-        </w:rPr>
-        <w:softHyphen/>
-      </w:r>
+          <w:sz w:val="36"/>
+          <w:szCs w:val="36"/>
+        </w:rPr>
+      </w:pPr>
     </w:p>
     <w:p>
       <w:pPr>
@@ -284,10 +219,110 @@
           <w:rFonts w:asciiTheme="majorHAnsi" w:hAnsiTheme="majorHAnsi" w:cstheme="majorHAnsi"/>
           <w:b/>
           <w:bCs/>
+          <w:sz w:val="36"/>
+          <w:szCs w:val="36"/>
+        </w:rPr>
+      </w:pPr>
+      <w:r>
+        <w:rPr>
+          <w:rFonts w:asciiTheme="majorHAnsi" w:hAnsiTheme="majorHAnsi" w:cstheme="majorHAnsi"/>
+          <w:b/>
+          <w:bCs/>
+          <w:sz w:val="36"/>
+          <w:szCs w:val="36"/>
+        </w:rPr>
+        <w:t xml:space="preserve">The system integrates high-throughput metabolomics data with curated pathway information from </w:t>
+      </w:r>
+      <w:proofErr w:type="spellStart"/>
+      <w:r>
+        <w:rPr>
+          <w:rFonts w:asciiTheme="majorHAnsi" w:hAnsiTheme="majorHAnsi" w:cstheme="majorHAnsi"/>
+          <w:b/>
+          <w:bCs/>
+          <w:sz w:val="36"/>
+          <w:szCs w:val="36"/>
+        </w:rPr>
+        <w:t>Reactome</w:t>
+      </w:r>
+      <w:proofErr w:type="spellEnd"/>
+      <w:r>
+        <w:rPr>
+          <w:rFonts w:asciiTheme="majorHAnsi" w:hAnsiTheme="majorHAnsi" w:cstheme="majorHAnsi"/>
+          <w:b/>
+          <w:bCs/>
+          <w:sz w:val="36"/>
+          <w:szCs w:val="36"/>
+        </w:rPr>
+        <w:t>:</w:t>
+      </w:r>
+    </w:p>
+    <w:p>
+      <w:pPr>
+        <w:ind w:left="720"/>
+        <w:rPr>
+          <w:rFonts w:asciiTheme="majorHAnsi" w:hAnsiTheme="majorHAnsi" w:cstheme="majorHAnsi"/>
+          <w:b/>
+          <w:bCs/>
+          <w:sz w:val="36"/>
+          <w:szCs w:val="36"/>
+        </w:rPr>
+      </w:pPr>
+    </w:p>
+    <w:p>
+      <w:pPr>
+        <w:ind w:left="720"/>
+        <w:rPr>
+          <w:rFonts w:asciiTheme="majorHAnsi" w:hAnsiTheme="majorHAnsi" w:cstheme="majorHAnsi"/>
+          <w:b/>
+          <w:bCs/>
+          <w:sz w:val="36"/>
+          <w:szCs w:val="36"/>
+        </w:rPr>
+      </w:pPr>
+      <w:r>
+        <w:rPr>
+          <w:rFonts w:asciiTheme="majorHAnsi" w:hAnsiTheme="majorHAnsi" w:cstheme="majorHAnsi"/>
+          <w:b/>
+          <w:bCs/>
+          <w:sz w:val="36"/>
+          <w:szCs w:val="36"/>
+        </w:rPr>
+        <w:t>https://reactome.org/PathwayBrowser/</w:t>
+      </w:r>
+    </w:p>
+    <w:p>
+      <w:pPr>
+        <w:ind w:left="720"/>
+        <w:rPr>
+          <w:rFonts w:asciiTheme="majorHAnsi" w:hAnsiTheme="majorHAnsi" w:cstheme="majorHAnsi"/>
+          <w:b/>
+          <w:bCs/>
+          <w:sz w:val="36"/>
+          <w:szCs w:val="36"/>
+        </w:rPr>
+      </w:pPr>
+    </w:p>
+    <w:p>
+      <w:pPr>
+        <w:ind w:left="720"/>
+        <w:rPr>
+          <w:rFonts w:asciiTheme="majorHAnsi" w:hAnsiTheme="majorHAnsi" w:cstheme="majorHAnsi"/>
+          <w:b/>
+          <w:bCs/>
           <w:sz w:val="40"/>
           <w:szCs w:val="40"/>
         </w:rPr>
       </w:pPr>
+      <w:r>
+        <w:rPr>
+          <w:rFonts w:asciiTheme="majorHAnsi" w:hAnsiTheme="majorHAnsi" w:cstheme="majorHAnsi"/>
+          <w:b/>
+          <w:bCs/>
+          <w:sz w:val="36"/>
+          <w:szCs w:val="36"/>
+        </w:rPr>
+        <w:t>The primary goal is to support researchers in interpreting metabolite-level changes at the pathway level, enabling biologically meaningful insights.</w:t>
+      </w:r>
     </w:p>
     <w:p>
       <w:pPr>
@@ -422,6 +457,7 @@
           <w:sz w:val="44"/>
           <w:szCs w:val="44"/>
         </w:rPr>
+        <w:lastRenderedPageBreak/>
         <w:softHyphen/>
       </w:r>
       <w:r>
@@ -480,27 +516,7 @@
           <w:sz w:val="36"/>
           <w:szCs w:val="36"/>
         </w:rPr>
-        <w:t xml:space="preserve">Input data format for gene expression: text file with </w:t>
-      </w:r>
-      <w:r>
-        <w:rPr>
-          <w:rFonts w:asciiTheme="majorHAnsi" w:hAnsiTheme="majorHAnsi" w:cstheme="majorHAnsi"/>
-          <w:b/>
-          <w:bCs/>
-          <w:sz w:val="36"/>
-          <w:szCs w:val="36"/>
-        </w:rPr>
-        <w:t xml:space="preserve">metabolites on the rows and samples (condition or control) on the </w:t>
-      </w:r>
-      <w:r>
-        <w:rPr>
-          <w:rFonts w:asciiTheme="majorHAnsi" w:hAnsiTheme="majorHAnsi" w:cstheme="majorHAnsi"/>
-          <w:b/>
-          <w:bCs/>
-          <w:sz w:val="36"/>
-          <w:szCs w:val="36"/>
-        </w:rPr>
-        <w:t xml:space="preserve">columns </w:t>
+        <w:t xml:space="preserve">Input data format for gene expression: text file with metabolites on the rows and samples (condition or control) on the columns </w:t>
       </w:r>
     </w:p>
     <w:sectPr>
@@ -514,7 +530,7 @@
 </file>
 
 <file path=word/numbering.xml><?xml version="1.0" encoding="utf-8"?>
-<w:numbering xmlns:wpc="http://schemas.microsoft.com/office/word/2010/wordprocessingCanvas" xmlns:cx="http://schemas.microsoft.com/office/drawing/2014/chartex" xmlns:cx1="http://schemas.microsoft.com/office/drawing/2015/9/8/chartex" xmlns:cx2="http://schemas.microsoft.com/office/drawing/2015/10/21/chartex" xmlns:cx3="http://schemas.microsoft.com/office/drawing/2016/5/9/chartex" xmlns:cx4="http://schemas.microsoft.com/office/drawing/2016/5/10/chartex" xmlns:cx5="http://schemas.microsoft.com/office/drawing/2016/5/11/chartex" xmlns:cx6="http://schemas.microsoft.com/office/drawing/2016/5/12/chartex" xmlns:cx7="http://schemas.microsoft.com/office/drawing/2016/5/13/chartex" xmlns:cx8="http://schemas.microsoft.com/office/drawing/2016/5/14/chartex" xmlns:mc="http://schemas.openxmlformats.org/markup-compatibility/2006" xmlns:aink="http://schemas.microsoft.com/office/drawing/2016/ink" xmlns:am3d="http://schemas.microsoft.com/office/drawing/2017/model3d" xmlns:o="urn:schemas-microsoft-com:office:office" xmlns:oel="http://schemas.microsoft.com/office/2019/extlst" xmlns:r="http://schemas.openxmlformats.org/officeDocument/2006/relationships" xmlns:m="http://schemas.openxmlformats.org/officeDocument/2006/math" xmlns:v="urn:schemas-microsoft-com:vml" xmlns:wp14="http://schemas.microsoft.com/office/word/2010/wordprocessingDrawing" xmlns:wp="http://schemas.openxmlformats.org/drawingml/2006/wordprocessingDrawing" xmlns:w10="urn:schemas-microsoft-com:office:word" xmlns:w="http://schemas.openxmlformats.org/wordprocessingml/2006/main" xmlns:w14="http://schemas.microsoft.com/office/word/2010/wordml" xmlns:w15="http://schemas.microsoft.com/office/word/2012/wordml" xmlns:w16cex="http://schemas.microsoft.com/office/word/2018/wordml/cex" xmlns:w16cid="http://schemas.microsoft.com/office/word/2016/wordml/cid" xmlns:w16="http://schemas.microsoft.com/office/word/2018/wordml" xmlns:w16sdtdh="http://schemas.microsoft.com/office/word/2020/wordml/sdtdatahash" xmlns:w16se="http://schemas.microsoft.com/office/word/2015/wordml/symex" xmlns:wpg="http://schemas.microsoft.com/office/word/2010/wordprocessingGroup" xmlns:wpi="http://schemas.microsoft.com/office/word/2010/wordprocessingInk" xmlns:wne="http://schemas.microsoft.com/office/word/2006/wordml" xmlns:wps="http://schemas.microsoft.com/office/word/2010/wordprocessingShape" mc:Ignorable="w14 w15 w16se w16cid w16 w16cex w16sdtdh wp14">
+<w:numbering xmlns:wpc="http://schemas.microsoft.com/office/word/2010/wordprocessingCanvas" xmlns:cx="http://schemas.microsoft.com/office/drawing/2014/chartex" xmlns:cx1="http://schemas.microsoft.com/office/drawing/2015/9/8/chartex" xmlns:cx2="http://schemas.microsoft.com/office/drawing/2015/10/21/chartex" xmlns:cx3="http://schemas.microsoft.com/office/drawing/2016/5/9/chartex" xmlns:cx4="http://schemas.microsoft.com/office/drawing/2016/5/10/chartex" xmlns:cx5="http://schemas.microsoft.com/office/drawing/2016/5/11/chartex" xmlns:cx6="http://schemas.microsoft.com/office/drawing/2016/5/12/chartex" xmlns:cx7="http://schemas.microsoft.com/office/drawing/2016/5/13/chartex" xmlns:cx8="http://schemas.microsoft.com/office/drawing/2016/5/14/chartex" xmlns:mc="http://schemas.openxmlformats.org/markup-compatibility/2006" xmlns:aink="http://schemas.microsoft.com/office/drawing/2016/ink" xmlns:am3d="http://schemas.microsoft.com/office/drawing/2017/model3d" xmlns:o="urn:schemas-microsoft-com:office:office" xmlns:oel="http://schemas.microsoft.com/office/2019/extlst" xmlns:r="http://schemas.openxmlformats.org/officeDocument/2006/relationships" xmlns:m="http://schemas.openxmlformats.org/officeDocument/2006/math" xmlns:v="urn:schemas-microsoft-com:vml" xmlns:wp14="http://schemas.microsoft.com/office/word/2010/wordprocessingDrawing" xmlns:wp="http://schemas.openxmlformats.org/drawingml/2006/wordprocessingDrawing" xmlns:w10="urn:schemas-microsoft-com:office:word" xmlns:w="http://schemas.openxmlformats.org/wordprocessingml/2006/main" xmlns:w14="http://schemas.microsoft.com/office/word/2010/wordml" xmlns:w15="http://schemas.microsoft.com/office/word/2012/wordml" xmlns:w16cex="http://schemas.microsoft.com/office/word/2018/wordml/cex" xmlns:w16cid="http://schemas.microsoft.com/office/word/2016/wordml/cid" xmlns:w16="http://schemas.microsoft.com/office/word/2018/wordml" xmlns:w16du="http://schemas.microsoft.com/office/word/2023/wordml/word16du" xmlns:w16sdtdh="http://schemas.microsoft.com/office/word/2020/wordml/sdtdatahash" xmlns:w16sdtfl="http://schemas.microsoft.com/office/word/2024/wordml/sdtformatlock" xmlns:w16se="http://schemas.microsoft.com/office/word/2015/wordml/symex" xmlns:wpg="http://schemas.microsoft.com/office/word/2010/wordprocessingGroup" xmlns:wpi="http://schemas.microsoft.com/office/word/2010/wordprocessingInk" xmlns:wne="http://schemas.microsoft.com/office/word/2006/wordml" xmlns:wps="http://schemas.microsoft.com/office/word/2010/wordprocessingShape" mc:Ignorable="w14 w15 w16se w16cid w16 w16cex w16sdtdh w16sdtfl w16du wp14">
   <w:abstractNum w:abstractNumId="0" w15:restartNumberingAfterBreak="0">
     <w:nsid w:val="2D862DBA"/>
     <w:multiLevelType w:val="hybridMultilevel"/>
@@ -867,7 +883,7 @@
 </file>
 
 <file path=word/styles.xml><?xml version="1.0" encoding="utf-8"?>
-<w:styles xmlns:mc="http://schemas.openxmlformats.org/markup-compatibility/2006" xmlns:r="http://schemas.openxmlformats.org/officeDocument/2006/relationships" xmlns:w="http://schemas.openxmlformats.org/wordprocessingml/2006/main" xmlns:w14="http://schemas.microsoft.com/office/word/2010/wordml" xmlns:w15="http://schemas.microsoft.com/office/word/2012/wordml" xmlns:w16cex="http://schemas.microsoft.com/office/word/2018/wordml/cex" xmlns:w16cid="http://schemas.microsoft.com/office/word/2016/wordml/cid" xmlns:w16="http://schemas.microsoft.com/office/word/2018/wordml" xmlns:w16sdtdh="http://schemas.microsoft.com/office/word/2020/wordml/sdtdatahash" xmlns:w16se="http://schemas.microsoft.com/office/word/2015/wordml/symex" mc:Ignorable="w14 w15 w16se w16cid w16 w16cex w16sdtdh">
+<w:styles xmlns:mc="http://schemas.openxmlformats.org/markup-compatibility/2006" xmlns:r="http://schemas.openxmlformats.org/officeDocument/2006/relationships" xmlns:w="http://schemas.openxmlformats.org/wordprocessingml/2006/main" xmlns:w14="http://schemas.microsoft.com/office/word/2010/wordml" xmlns:w15="http://schemas.microsoft.com/office/word/2012/wordml" xmlns:w16cex="http://schemas.microsoft.com/office/word/2018/wordml/cex" xmlns:w16cid="http://schemas.microsoft.com/office/word/2016/wordml/cid" xmlns:w16="http://schemas.microsoft.com/office/word/2018/wordml" xmlns:w16du="http://schemas.microsoft.com/office/word/2023/wordml/word16du" xmlns:w16sdtdh="http://schemas.microsoft.com/office/word/2020/wordml/sdtdatahash" xmlns:w16sdtfl="http://schemas.microsoft.com/office/word/2024/wordml/sdtformatlock" xmlns:w16se="http://schemas.microsoft.com/office/word/2015/wordml/symex" mc:Ignorable="w14 w15 w16se w16cid w16 w16cex w16sdtdh w16sdtfl w16du">
   <w:docDefaults>
     <w:rPrDefault>
       <w:rPr>
@@ -1264,6 +1280,7 @@
   <w:style w:type="character" w:default="1" w:styleId="DefaultParagraphFont">
     <w:name w:val="Default Paragraph Font"/>
     <w:uiPriority w:val="1"/>
+    <w:semiHidden/>
     <w:unhideWhenUsed/>
   </w:style>
   <w:style w:type="table" w:default="1" w:styleId="TableNormal">
@@ -1617,4 +1634,198 @@
     </a:ext>
   </a:extLst>
 </a:theme>
+</file>
+
+<file path=customXml/item1.xml><?xml version="1.0" encoding="utf-8"?>
+<ct:contentTypeSchema xmlns:ct="http://schemas.microsoft.com/office/2006/metadata/contentType" xmlns:ma="http://schemas.microsoft.com/office/2006/metadata/properties/metaAttributes" ct:_="" ma:_="" ma:contentTypeName="Document" ma:contentTypeID="0x010100C0B58A824013984DB73E92BBCB9B65ED" ma:contentTypeVersion="4" ma:contentTypeDescription="Create a new document." ma:contentTypeScope="" ma:versionID="edcc3cc4ebddd4281eecbfb1ce57a6a6">
+  <xsd:schema xmlns:xsd="http://www.w3.org/2001/XMLSchema" xmlns:xs="http://www.w3.org/2001/XMLSchema" xmlns:p="http://schemas.microsoft.com/office/2006/metadata/properties" xmlns:ns3="78c752df-a942-46e2-9bd0-8b0c526d5121" targetNamespace="http://schemas.microsoft.com/office/2006/metadata/properties" ma:root="true" ma:fieldsID="b81f90651ac4596984b8a58d8fda8497" ns3:_="">
+    <xsd:import namespace="78c752df-a942-46e2-9bd0-8b0c526d5121"/>
+    <xsd:element name="properties">
+      <xsd:complexType>
+        <xsd:sequence>
+          <xsd:element name="documentManagement">
+            <xsd:complexType>
+              <xsd:all>
+                <xsd:element ref="ns3:MediaServiceDateTaken" minOccurs="0"/>
+                <xsd:element ref="ns3:MediaServiceMetadata" minOccurs="0"/>
+                <xsd:element ref="ns3:MediaServiceFastMetadata" minOccurs="0"/>
+                <xsd:element ref="ns3:MediaServiceSearchProperties" minOccurs="0"/>
+              </xsd:all>
+            </xsd:complexType>
+          </xsd:element>
+        </xsd:sequence>
+      </xsd:complexType>
+    </xsd:element>
+  </xsd:schema>
+  <xsd:schema xmlns:xsd="http://www.w3.org/2001/XMLSchema" xmlns:xs="http://www.w3.org/2001/XMLSchema" xmlns:dms="http://schemas.microsoft.com/office/2006/documentManagement/types" xmlns:pc="http://schemas.microsoft.com/office/infopath/2007/PartnerControls" targetNamespace="78c752df-a942-46e2-9bd0-8b0c526d5121" elementFormDefault="qualified">
+    <xsd:import namespace="http://schemas.microsoft.com/office/2006/documentManagement/types"/>
+    <xsd:import namespace="http://schemas.microsoft.com/office/infopath/2007/PartnerControls"/>
+    <xsd:element name="MediaServiceDateTaken" ma:index="8" nillable="true" ma:displayName="MediaServiceDateTaken" ma:hidden="true" ma:indexed="true" ma:internalName="MediaServiceDateTaken" ma:readOnly="true">
+      <xsd:simpleType>
+        <xsd:restriction base="dms:Text"/>
+      </xsd:simpleType>
+    </xsd:element>
+    <xsd:element name="MediaServiceMetadata" ma:index="9" nillable="true" ma:displayName="MediaServiceMetadata" ma:hidden="true" ma:internalName="MediaServiceMetadata" ma:readOnly="true">
+      <xsd:simpleType>
+        <xsd:restriction base="dms:Note"/>
+      </xsd:simpleType>
+    </xsd:element>
+    <xsd:element name="MediaServiceFastMetadata" ma:index="10" nillable="true" ma:displayName="MediaServiceFastMetadata" ma:hidden="true" ma:internalName="MediaServiceFastMetadata" ma:readOnly="true">
+      <xsd:simpleType>
+        <xsd:restriction base="dms:Note"/>
+      </xsd:simpleType>
+    </xsd:element>
+    <xsd:element name="MediaServiceSearchProperties" ma:index="11" nillable="true" ma:displayName="MediaServiceSearchProperties" ma:hidden="true" ma:internalName="MediaServiceSearchProperties" ma:readOnly="true">
+      <xsd:simpleType>
+        <xsd:restriction base="dms:Note"/>
+      </xsd:simpleType>
+    </xsd:element>
+  </xsd:schema>
+  <xsd:schema xmlns="http://schemas.openxmlformats.org/package/2006/metadata/core-properties" xmlns:xsd="http://www.w3.org/2001/XMLSchema" xmlns:xsi="http://www.w3.org/2001/XMLSchema-instance" xmlns:dc="http://purl.org/dc/elements/1.1/" xmlns:dcterms="http://purl.org/dc/terms/" xmlns:odoc="http://schemas.microsoft.com/internal/obd" targetNamespace="http://schemas.openxmlformats.org/package/2006/metadata/core-properties" elementFormDefault="qualified" attributeFormDefault="unqualified" blockDefault="#all">
+    <xsd:import namespace="http://purl.org/dc/elements/1.1/" schemaLocation="http://dublincore.org/schemas/xmls/qdc/2003/04/02/dc.xsd"/>
+    <xsd:import namespace="http://purl.org/dc/terms/" schemaLocation="http://dublincore.org/schemas/xmls/qdc/2003/04/02/dcterms.xsd"/>
+    <xsd:element name="coreProperties" type="CT_coreProperties"/>
+    <xsd:complexType name="CT_coreProperties">
+      <xsd:all>
+        <xsd:element ref="dc:creator" minOccurs="0" maxOccurs="1"/>
+        <xsd:element ref="dcterms:created" minOccurs="0" maxOccurs="1"/>
+        <xsd:element ref="dc:identifier" minOccurs="0" maxOccurs="1"/>
+        <xsd:element name="contentType" minOccurs="0" maxOccurs="1" type="xsd:string" ma:index="0" ma:displayName="Content Type"/>
+        <xsd:element ref="dc:title" minOccurs="0" maxOccurs="1" ma:index="4" ma:displayName="Title"/>
+        <xsd:element ref="dc:subject" minOccurs="0" maxOccurs="1"/>
+        <xsd:element ref="dc:description" minOccurs="0" maxOccurs="1"/>
+        <xsd:element name="keywords" minOccurs="0" maxOccurs="1" type="xsd:string"/>
+        <xsd:element ref="dc:language" minOccurs="0" maxOccurs="1"/>
+        <xsd:element name="category" minOccurs="0" maxOccurs="1" type="xsd:string"/>
+        <xsd:element name="version" minOccurs="0" maxOccurs="1" type="xsd:string"/>
+        <xsd:element name="revision" minOccurs="0" maxOccurs="1" type="xsd:string">
+          <xsd:annotation>
+            <xsd:documentation>
+                        This value indicates the number of saves or revisions. The application is responsible for updating this value after each revision.
+                    </xsd:documentation>
+          </xsd:annotation>
+        </xsd:element>
+        <xsd:element name="lastModifiedBy" minOccurs="0" maxOccurs="1" type="xsd:string"/>
+        <xsd:element ref="dcterms:modified" minOccurs="0" maxOccurs="1"/>
+        <xsd:element name="contentStatus" minOccurs="0" maxOccurs="1" type="xsd:string"/>
+      </xsd:all>
+    </xsd:complexType>
+  </xsd:schema>
+  <xs:schema xmlns:pc="http://schemas.microsoft.com/office/infopath/2007/PartnerControls" xmlns:xs="http://www.w3.org/2001/XMLSchema" targetNamespace="http://schemas.microsoft.com/office/infopath/2007/PartnerControls" elementFormDefault="qualified" attributeFormDefault="unqualified">
+    <xs:element name="Person">
+      <xs:complexType>
+        <xs:sequence>
+          <xs:element ref="pc:DisplayName" minOccurs="0"/>
+          <xs:element ref="pc:AccountId" minOccurs="0"/>
+          <xs:element ref="pc:AccountType" minOccurs="0"/>
+        </xs:sequence>
+      </xs:complexType>
+    </xs:element>
+    <xs:element name="DisplayName" type="xs:string"/>
+    <xs:element name="AccountId" type="xs:string"/>
+    <xs:element name="AccountType" type="xs:string"/>
+    <xs:element name="BDCAssociatedEntity">
+      <xs:complexType>
+        <xs:sequence>
+          <xs:element ref="pc:BDCEntity" minOccurs="0" maxOccurs="unbounded"/>
+        </xs:sequence>
+        <xs:attribute ref="pc:EntityNamespace"/>
+        <xs:attribute ref="pc:EntityName"/>
+        <xs:attribute ref="pc:SystemInstanceName"/>
+        <xs:attribute ref="pc:AssociationName"/>
+      </xs:complexType>
+    </xs:element>
+    <xs:attribute name="EntityNamespace" type="xs:string"/>
+    <xs:attribute name="EntityName" type="xs:string"/>
+    <xs:attribute name="SystemInstanceName" type="xs:string"/>
+    <xs:attribute name="AssociationName" type="xs:string"/>
+    <xs:element name="BDCEntity">
+      <xs:complexType>
+        <xs:sequence>
+          <xs:element ref="pc:EntityDisplayName" minOccurs="0"/>
+          <xs:element ref="pc:EntityInstanceReference" minOccurs="0"/>
+          <xs:element ref="pc:EntityId1" minOccurs="0"/>
+          <xs:element ref="pc:EntityId2" minOccurs="0"/>
+          <xs:element ref="pc:EntityId3" minOccurs="0"/>
+          <xs:element ref="pc:EntityId4" minOccurs="0"/>
+          <xs:element ref="pc:EntityId5" minOccurs="0"/>
+        </xs:sequence>
+      </xs:complexType>
+    </xs:element>
+    <xs:element name="EntityDisplayName" type="xs:string"/>
+    <xs:element name="EntityInstanceReference" type="xs:string"/>
+    <xs:element name="EntityId1" type="xs:string"/>
+    <xs:element name="EntityId2" type="xs:string"/>
+    <xs:element name="EntityId3" type="xs:string"/>
+    <xs:element name="EntityId4" type="xs:string"/>
+    <xs:element name="EntityId5" type="xs:string"/>
+    <xs:element name="Terms">
+      <xs:complexType>
+        <xs:sequence>
+          <xs:element ref="pc:TermInfo" minOccurs="0" maxOccurs="unbounded"/>
+        </xs:sequence>
+      </xs:complexType>
+    </xs:element>
+    <xs:element name="TermInfo">
+      <xs:complexType>
+        <xs:sequence>
+          <xs:element ref="pc:TermName" minOccurs="0"/>
+          <xs:element ref="pc:TermId" minOccurs="0"/>
+        </xs:sequence>
+      </xs:complexType>
+    </xs:element>
+    <xs:element name="TermName" type="xs:string"/>
+    <xs:element name="TermId" type="xs:string"/>
+  </xs:schema>
+</ct:contentTypeSchema>
+</file>
+
+<file path=customXml/item2.xml><?xml version="1.0" encoding="utf-8"?>
+<?mso-contentType ?>
+<FormTemplates xmlns="http://schemas.microsoft.com/sharepoint/v3/contenttype/forms">
+  <Display>DocumentLibraryForm</Display>
+  <Edit>DocumentLibraryForm</Edit>
+  <New>DocumentLibraryForm</New>
+</FormTemplates>
+</file>
+
+<file path=customXml/item3.xml><?xml version="1.0" encoding="utf-8"?>
+<p:properties xmlns:p="http://schemas.microsoft.com/office/2006/metadata/properties" xmlns:xsi="http://www.w3.org/2001/XMLSchema-instance" xmlns:pc="http://schemas.microsoft.com/office/infopath/2007/PartnerControls">
+  <documentManagement/>
+</p:properties>
+</file>
+
+<file path=customXml/itemProps1.xml><?xml version="1.0" encoding="utf-8"?>
+<ds:datastoreItem xmlns:ds="http://schemas.openxmlformats.org/officeDocument/2006/customXml" ds:itemID="{FFA0ADF1-A6C4-426E-B53D-82216929FF1E}">
+  <ds:schemaRefs>
+    <ds:schemaRef ds:uri="http://schemas.microsoft.com/office/2006/metadata/contentType"/>
+    <ds:schemaRef ds:uri="http://schemas.microsoft.com/office/2006/metadata/properties/metaAttributes"/>
+    <ds:schemaRef ds:uri="http://www.w3.org/2001/XMLSchema"/>
+    <ds:schemaRef ds:uri="http://schemas.microsoft.com/office/2006/metadata/properties"/>
+    <ds:schemaRef ds:uri="78c752df-a942-46e2-9bd0-8b0c526d5121"/>
+    <ds:schemaRef ds:uri="http://schemas.microsoft.com/office/2006/documentManagement/types"/>
+    <ds:schemaRef ds:uri="http://schemas.microsoft.com/office/infopath/2007/PartnerControls"/>
+    <ds:schemaRef ds:uri="http://schemas.openxmlformats.org/package/2006/metadata/core-properties"/>
+    <ds:schemaRef ds:uri="http://purl.org/dc/elements/1.1/"/>
+    <ds:schemaRef ds:uri="http://purl.org/dc/terms/"/>
+    <ds:schemaRef ds:uri="http://schemas.microsoft.com/internal/obd"/>
+  </ds:schemaRefs>
+</ds:datastoreItem>
+</file>
+
+<file path=customXml/itemProps2.xml><?xml version="1.0" encoding="utf-8"?>
+<ds:datastoreItem xmlns:ds="http://schemas.openxmlformats.org/officeDocument/2006/customXml" ds:itemID="{1C3FFFDB-5C3B-4D8A-A52C-EA5E98BFE62E}">
+  <ds:schemaRefs>
+    <ds:schemaRef ds:uri="http://schemas.microsoft.com/sharepoint/v3/contenttype/forms"/>
+  </ds:schemaRefs>
+</ds:datastoreItem>
+</file>
+
+<file path=customXml/itemProps3.xml><?xml version="1.0" encoding="utf-8"?>
+<ds:datastoreItem xmlns:ds="http://schemas.openxmlformats.org/officeDocument/2006/customXml" ds:itemID="{7200FEB5-5CD7-41FA-B210-B330722DDDC8}">
+  <ds:schemaRefs>
+    <ds:schemaRef ds:uri="http://schemas.microsoft.com/office/2006/metadata/properties"/>
+    <ds:schemaRef ds:uri="http://schemas.microsoft.com/office/infopath/2007/PartnerControls"/>
+  </ds:schemaRefs>
+</ds:datastoreItem>
 </file>
</xml_diff>